<commit_message>
Materialy k databazim: kurz v DB Browseru bez instalace
- Jak toto tema ucit: lekce 14-19 v kurzu na /sql, skutecny
  DB Browser jen jako nepovinny prenos; nova cast V kurzu navic
  (detektivka, procvicovani A/B na pisemku, Moje vysledky a Prehled
  tridy, uloha odkazem, anglicka verze) a kontrola pred prvni hodinou.
- Navod a Ulohy - DB Browser: nepovinne, ulohy 3-6 odpovidaji
  lekcim 16-19; Reseni a Pracovni list srovnane s kurzem.
- Plan hodin - Kurz SQL: druha hodina v kurzu misto instalace.

Co-Authored-By: Claude Opus 5.5 <noreply@anthropic.com>
</commit_message>
<xml_diff>
--- a/public/materialy/1L/8/_ucitel/2. Kurz SQL v prohlížeči/Plán hodin - Kurz SQL.docx
+++ b/public/materialy/1L/8/_ucitel/2. Kurz SQL v prohlížeči/Plán hodin - Kurz SQL.docx
@@ -125,12 +125,11 @@
             <w:tcW w:type="dxa" w:w="4320"/>
           </w:tcPr>
           <w:p>
-            <w:r/>
             <w:r>
               <w:rPr>
                 <w:sz w:val="20"/>
               </w:rPr>
-              <w:t>Jazyk SQL — od prvního SELECT přes JOIN až po změnu dat, poté práce v reálném programu</w:t>
+              <w:t xml:space="preserve">Jazyk SQL — od prvního SELECT přes JOIN až po změnu dat, poté práce v programu DB Browser (v kurzu jeho napodobenina v prohlížeči)</w:t>
             </w:r>
           </w:p>
         </w:tc>
@@ -185,12 +184,11 @@
             <w:tcW w:type="dxa" w:w="4320"/>
           </w:tcPr>
           <w:p>
-            <w:r/>
             <w:r>
               <w:rPr>
                 <w:sz w:val="20"/>
               </w:rPr>
-              <w:t>2× 45 minut (hodina 1: kurz v prohlížeči, hodina 2: DB Browser)</w:t>
+              <w:t xml:space="preserve">2× 45 minut (hodina 1: lekce 1–13 kurzu, hodina 2: lekce 14–19 – práce v programu DB Browser)</w:t>
             </w:r>
           </w:p>
         </w:tc>
@@ -215,12 +213,11 @@
             <w:tcW w:type="dxa" w:w="4320"/>
           </w:tcPr>
           <w:p>
-            <w:r/>
             <w:r>
               <w:rPr>
                 <w:sz w:val="20"/>
               </w:rPr>
-              <w:t>Počítače s internetem a prohlížečem; pro hodinu 2 program DB Browser for SQLite (zdarma, existuje i portable verze bez instalace)</w:t>
+              <w:t xml:space="preserve">Počítače s internetem a prohlížečem. Nic se neinstaluje – i hodina 2 běží v kurzu (napodobenina programu DB Browser for SQLite). Skutečný program je nepovinný přenos domů.</w:t>
             </w:r>
           </w:p>
         </w:tc>
@@ -271,7 +268,7 @@
     </w:p>
     <w:p>
       <w:r>
-        <w:t>Žák čte a samostatně píše základní dotazy SQL nad připravenou databází školní knihovny: vybírá data (SELECT), filtruje (WHERE), řadí (ORDER BY), agreguje (COUNT, AVG, GROUP BY) a propojuje tabulky (JOIN). V druhé hodině tytéž dovednosti použije v reálném programu (DB Browser for SQLite) — otevře databázi, spouští dotazy, upravuje data a vytvoří vlastní tabulku.</w:t>
+        <w:t xml:space="preserve">Žák čte a samostatně píše základní dotazy SQL nad připravenou databází školní knihovny: vybírá data (SELECT), filtruje (WHERE), řadí (ORDER BY), agreguje (COUNT, AVG, GROUP BY) a propojuje tabulky (JOIN). V druhé hodině pracuje v programu DB Browser for SQLite (v kurzu jeho napodobenina, nic se neinstaluje) — prohlíží strukturu a data, zapisuje změny do souboru a vytvoří vlastní tabulku.</w:t>
       </w:r>
     </w:p>
     <w:p>
@@ -366,10 +363,7 @@
         <w:rPr>
           <w:b/>
         </w:rPr>
-        <w:t xml:space="preserve">Kurz: </w:t>
-      </w:r>
-      <w:r>
-        <w:t>karelhlas.vercel.app/sql — interaktivní kurz (13 lekcí), nic se neinstaluje</w:t>
+        <w:t xml:space="preserve">Kurz: karelhlas.vercel.app/sql — interaktivní kurz, 19 lekcí (na počítači ve virtuálním DB Browseru, na telefonu lekce 1–13 jako webová stránka), nic se neinstaluje</w:t>
       </w:r>
     </w:p>
     <w:p>
@@ -380,10 +374,7 @@
         <w:rPr>
           <w:b/>
         </w:rPr>
-        <w:t xml:space="preserve">Hodina 2: </w:t>
-      </w:r>
-      <w:r>
-        <w:t>knihovna.db (stejná databáze jako v kurzu), Návod - DB Browser, Úlohy - DB Browser (6 úloh)</w:t>
+        <w:t xml:space="preserve">Hodina 2: lekce 14–19 kurzu. Nepovinně pro skutečný program: knihovna.db, Návod - DB Browser, Úlohy - DB Browser (6 úloh)</w:t>
       </w:r>
     </w:p>
     <w:p>
@@ -410,7 +401,7 @@
           <w:color w:val="0B9273"/>
           <w:sz w:val="26"/>
         </w:rPr>
-        <w:t>Hodina 1 — Kurz SQL v prohlížeči (45 min)</w:t>
+        <w:t xml:space="preserve">Hodina 1 — Kurz SQL, lekce 1–13 (45 min)</w:t>
       </w:r>
     </w:p>
     <w:tbl>
@@ -580,12 +571,11 @@
             <w:tcW w:type="dxa" w:w="2160"/>
           </w:tcPr>
           <w:p>
-            <w:r/>
             <w:r>
               <w:rPr>
                 <w:sz w:val="20"/>
               </w:rPr>
-              <w:t>Promítne kurz, projde lekci 1 společně: přečíst výklad, spustit příklad, splnit úkol, ukázat Zkontrolovat i nápovědu.</w:t>
+              <w:t xml:space="preserve">Promítne kurz (Nápověda → Režim předvádění: větší písmo, vlastní postup) a projde lekci 1 společně: přečíst výklad, napsat dotaz, spustit ho klávesou F5 – úkol se odškrtne sám. Ukáže nápovědu.</w:t>
             </w:r>
           </w:p>
         </w:tc>
@@ -652,12 +642,11 @@
             <w:tcW w:type="dxa" w:w="2160"/>
           </w:tcPr>
           <w:p>
-            <w:r/>
             <w:r>
               <w:rPr>
                 <w:sz w:val="20"/>
               </w:rPr>
-              <w:t>Píší dotazy, kontrolují si je, postupují po lekcích. Postup se ukládá.</w:t>
+              <w:t xml:space="preserve">Píší dotazy, spouštějí je (F5), postupují po lekcích. Postup se ukládá.</w:t>
             </w:r>
           </w:p>
         </w:tc>
@@ -789,7 +778,7 @@
           <w:color w:val="0B9273"/>
           <w:sz w:val="26"/>
         </w:rPr>
-        <w:t>Hodina 2 — Stejná databáze v opravdovém programu (45 min)</w:t>
+        <w:t xml:space="preserve">Hodina 2 — Práce v programu DB Browser, lekce 14–19 (45 min)</w:t>
       </w:r>
     </w:p>
     <w:tbl>
@@ -901,12 +890,11 @@
             <w:tcW w:type="dxa" w:w="2160"/>
           </w:tcPr>
           <w:p>
-            <w:r/>
             <w:r>
               <w:rPr>
                 <w:sz w:val="20"/>
               </w:rPr>
-              <w:t>Otázka: „Kde ta data z kurzu vlastně bydlí?“ Ukáže stažení knihovna.db a otevření v DB Browseru (návod je v bance).</w:t>
+              <w:t xml:space="preserve">Otázka: „Kde ta data z kurzu vlastně bydlí?“ Ukáže, že kurz celou dobu běží v napodobenině programu DB Browser, a kartu Struktura databáze (lekce 14).</w:t>
             </w:r>
           </w:p>
         </w:tc>
@@ -915,12 +903,11 @@
             <w:tcW w:type="dxa" w:w="2160"/>
           </w:tcPr>
           <w:p>
-            <w:r/>
             <w:r>
               <w:rPr>
                 <w:sz w:val="20"/>
               </w:rPr>
-              <w:t>Stahují databázi, otevírají ji, prohlížejí tabulky.</w:t>
+              <w:t xml:space="preserve">Plní lekci 14: rozbalí tabulky, najdou cizí klíče.</w:t>
             </w:r>
           </w:p>
         </w:tc>
@@ -945,12 +932,11 @@
             <w:tcW w:type="dxa" w:w="2160"/>
           </w:tcPr>
           <w:p>
-            <w:r/>
             <w:r>
               <w:rPr>
                 <w:sz w:val="20"/>
               </w:rPr>
-              <w:t>Most z kurzu</w:t>
+              <w:t xml:space="preserve">Prohlížet data</w:t>
             </w:r>
           </w:p>
         </w:tc>
@@ -959,12 +945,11 @@
             <w:tcW w:type="dxa" w:w="2160"/>
           </w:tcPr>
           <w:p>
-            <w:r/>
             <w:r>
               <w:rPr>
                 <w:sz w:val="20"/>
               </w:rPr>
-              <w:t>Nechá žáky spustit v záložce Execute SQL dotaz, který už znají z kurzu — funguje beze změny.</w:t>
+              <w:t xml:space="preserve">Lekce 15: filtr a úprava buňky v mřížce – program za žáka pošle UPDATE, žák ho uvidí v Logu SQL.</w:t>
             </w:r>
           </w:p>
         </w:tc>
@@ -973,12 +958,11 @@
             <w:tcW w:type="dxa" w:w="2160"/>
           </w:tcPr>
           <w:p>
-            <w:r/>
             <w:r>
               <w:rPr>
                 <w:sz w:val="20"/>
               </w:rPr>
-              <w:t>Ověřují, že jejich SQL funguje i mimo web.</w:t>
+              <w:t xml:space="preserve">Filtrují a upravují data klikáním.</w:t>
             </w:r>
           </w:p>
         </w:tc>
@@ -1003,12 +987,11 @@
             <w:tcW w:type="dxa" w:w="2160"/>
           </w:tcPr>
           <w:p>
-            <w:r/>
             <w:r>
               <w:rPr>
                 <w:sz w:val="20"/>
               </w:rPr>
-              <w:t>Úlohy 1–5</w:t>
+              <w:t xml:space="preserve">Lekce 16–18</w:t>
             </w:r>
           </w:p>
         </w:tc>
@@ -1017,12 +1000,11 @@
             <w:tcW w:type="dxa" w:w="2160"/>
           </w:tcPr>
           <w:p>
-            <w:r/>
             <w:r>
               <w:rPr>
                 <w:sz w:val="20"/>
               </w:rPr>
-              <w:t>Zadá Úlohy - DB Browser. Pozor: nejde o nové příkazy (ty žák umí z kurzu), ale o zápis změn do souboru a o stavbu vlastní tabulky. Obchází a pomáhá.</w:t>
+              <w:t xml:space="preserve">Lekce 16 (zápis změn: změnit, zavřít bez uložení, znovu otevřít), 17 (vlastní tabulka hodnoceni) a 18 (JOIN přes vlastní klíč). Pozor: nejde o nové příkazy (ty žák umí), ale o zápis změn do souboru a o stavbu vlastní tabulky. Obchází a pomáhá.</w:t>
             </w:r>
           </w:p>
         </w:tc>
@@ -1031,12 +1013,11 @@
             <w:tcW w:type="dxa" w:w="2160"/>
           </w:tcPr>
           <w:p>
-            <w:r/>
             <w:r>
               <w:rPr>
                 <w:sz w:val="20"/>
               </w:rPr>
-              <w:t>Řeší úlohy, ukládají změny (Write Changes).</w:t>
+              <w:t xml:space="preserve">Plní lekce, zapisují změny (Zapsat změny, Ctrl+S).</w:t>
             </w:r>
           </w:p>
         </w:tc>
@@ -1075,12 +1056,11 @@
             <w:tcW w:type="dxa" w:w="2160"/>
           </w:tcPr>
           <w:p>
-            <w:r/>
             <w:r>
               <w:rPr>
                 <w:sz w:val="20"/>
               </w:rPr>
-              <w:t>Projde řešení vybraných úloh, žáci porovnají. Shrnutí: prohlížeč → program → (výhled) velké databáze na serverech.</w:t>
+              <w:t xml:space="preserve">Projde lekci 17 na plátně, žáci porovnají. Shrnutí: soubor → program → (výhled) velké databáze na serverech. Lekci 19 (vlastní databáze) zadá za domácí úkol: odevzdat stažený soubor .db.</w:t>
             </w:r>
           </w:p>
         </w:tc>
@@ -1126,7 +1106,7 @@
         <w:pStyle w:val="ListBullet"/>
       </w:pPr>
       <w:r>
-        <w:t>Kurz potřebuje internet (databázový modul se načítá při otevření stránky). Bez internetu přehoď pořadí a začni hodinou 2 — DB Browser funguje offline, soubory měj stažené předem.</w:t>
+        <w:t xml:space="preserve">Kurz potřebuje internet (databázový modul se načítá při otevření stránky) – i v hodině 2. Bez internetu zbývá skutečný DB Browser, pokud je na počítačích nainstalovaný; soubory měj stažené předem.</w:t>
       </w:r>
     </w:p>
     <w:p>
@@ -1142,7 +1122,7 @@
         <w:pStyle w:val="ListBullet"/>
       </w:pPr>
       <w:r>
-        <w:t>V hodině 2 zdůrazni tlačítko Write Changes — DB Browser změny neukládá průběžně; žákům to rozbije úlohu 3, pokud na to zapomenou.</w:t>
+        <w:t xml:space="preserve">V hodině 2 zdůrazni tlačítko Zapsat změny — program změny neukládá průběžně. Lekce 16 to nechá žáky zažít: změna bez zápisu po zavření zmizí.</w:t>
       </w:r>
     </w:p>
     <w:p>
@@ -1150,7 +1130,7 @@
         <w:pStyle w:val="ListBullet"/>
       </w:pPr>
       <w:r>
-        <w:t>del/DROP: pokud si žáci databázi rozbijí, není co řešit — stáhnou si knihovna.db znovu. Klidně to řekni předem, odstraní to strach experimentovat.</w:t>
+        <w:t xml:space="preserve">DELETE/DROP: pokud si žáci databázi rozbijí, není co řešit — Vrátit změny, nebo Nápověda → Obnovit původní knihovna.db. Klidně to řekni předem, odstraní to strach experimentovat.</w:t>
       </w:r>
     </w:p>
     <w:p>
@@ -1229,12 +1209,11 @@
             <w:tcW w:type="dxa" w:w="4320"/>
           </w:tcPr>
           <w:p>
-            <w:r/>
             <w:r>
               <w:rPr>
                 <w:sz w:val="20"/>
               </w:rPr>
-              <w:t>Hodina 1: cíl = lekce 1–6 (po COUNT), zbytek doma. Hodina 2: úlohy 1–4, práce ve dvojici.</w:t>
+              <w:t xml:space="preserve">Hodina 1: cíl = lekce 1–6 (po COUNT), zbytek doma. Hodina 2: lekce 14–17, práce ve dvojici.</w:t>
             </w:r>
           </w:p>
         </w:tc>
@@ -1259,12 +1238,11 @@
             <w:tcW w:type="dxa" w:w="4320"/>
           </w:tcPr>
           <w:p>
-            <w:r/>
             <w:r>
               <w:rPr>
                 <w:sz w:val="20"/>
               </w:rPr>
-              <w:t>Celý kurz (13 lekcí) + úlohy 1–6 v DB Browseru.</w:t>
+              <w:t xml:space="preserve">Lekce 1–13 v hodině 1, lekce 14–18 v hodině 2, lekce 19 doma.</w:t>
             </w:r>
           </w:p>
         </w:tc>
@@ -1315,7 +1293,7 @@
     </w:p>
     <w:p>
       <w:r>
-        <w:t>Hodina 1: dokončené lekce kurzu (postup vidí žák přímo na obrazovce — „Hotovo X/13“). Hodina 2: splněné úlohy 1–6 v DB Browseru, odevzdané podle pokynů učitele (snímky obrazovky s výsledky dotazů, případně upravený soubor knihovna.db).</w:t>
+        <w:t xml:space="preserve">Hodina 1 i 2: obrazovka Moje výsledky v kurzu (Nápověda → Moje výsledky, „Splněno X/19“) – žák ji ukáže nebo vyfotí; šedá fajfka = úkol splněný vložením řešení. Lekce 19: stažený soubor vlastní databáze (.db), odevzdaný podle pokynů učitele.</w:t>
       </w:r>
     </w:p>
     <w:p>
@@ -1394,12 +1372,11 @@
             <w:tcW w:type="dxa" w:w="4320"/>
           </w:tcPr>
           <w:p>
-            <w:r/>
             <w:r>
               <w:rPr>
                 <w:sz w:val="20"/>
               </w:rPr>
-              <w:t>Kurz dokončen (nebo lekce 1–10) a úlohy 1–6 správně; dotazy píše samostatně.</w:t>
+              <w:t xml:space="preserve">Lekce 1–18 splněné bez vkládání řešení (nebo aspoň 1–10 a 14–18) a odevzdaná vlastní databáze z lekce 19; dotazy píše samostatně.</w:t>
             </w:r>
           </w:p>
         </w:tc>
@@ -1424,12 +1401,11 @@
             <w:tcW w:type="dxa" w:w="4320"/>
           </w:tcPr>
           <w:p>
-            <w:r/>
             <w:r>
               <w:rPr>
                 <w:sz w:val="20"/>
               </w:rPr>
-              <w:t>Drobné zaváhání u JOIN/GROUP BY; úlohy s malou dopomocí.</w:t>
+              <w:t xml:space="preserve">Drobné zaváhání u JOIN/GROUP BY; lekce 14–19 s malou dopomocí.</w:t>
             </w:r>
           </w:p>
         </w:tc>
@@ -1454,12 +1430,11 @@
             <w:tcW w:type="dxa" w:w="4320"/>
           </w:tcPr>
           <w:p>
-            <w:r/>
             <w:r>
               <w:rPr>
                 <w:sz w:val="20"/>
               </w:rPr>
-              <w:t>Zvládá SELECT/WHERE/ORDER BY, agregace a JOIN jen s pomocí; úlohy částečně.</w:t>
+              <w:t xml:space="preserve">Zvládá SELECT/WHERE/ORDER BY, agregace a JOIN jen s pomocí; lekce 14–19 částečně.</w:t>
             </w:r>
           </w:p>
         </w:tc>
@@ -1601,12 +1576,11 @@
             <w:tcW w:type="dxa" w:w="4320"/>
           </w:tcPr>
           <w:p>
-            <w:r/>
             <w:r>
               <w:rPr>
                 <w:sz w:val="20"/>
               </w:rPr>
-              <w:t>Začni hodinou 2 (DB Browser je offline); kurz zařaď příště nebo za domácí úkol.</w:t>
+              <w:t xml:space="preserve">Kurz i hodina 2 potřebují internet. Když je na počítačích skutečný DB Browser, pracuj v něm podle Úloh - DB Browser; jinak hodinu přesuň.</w:t>
             </w:r>
           </w:p>
         </w:tc>
@@ -1661,12 +1635,11 @@
             <w:tcW w:type="dxa" w:w="4320"/>
           </w:tcPr>
           <w:p>
-            <w:r/>
             <w:r>
               <w:rPr>
                 <w:sz w:val="20"/>
               </w:rPr>
-              <w:t>DB Browser existuje jako portable .zip (sqlitebrowser.org) — rozbalit a spustit, bez instalace.</w:t>
+              <w:t xml:space="preserve">Nevadí — celé téma běží v kurzu v prohlížeči, včetně práce v programu (lekce 14–19). Skutečný DB Browser je nepovinný přenos domů.</w:t>
             </w:r>
           </w:p>
         </w:tc>
@@ -1691,12 +1664,11 @@
             <w:tcW w:type="dxa" w:w="4320"/>
           </w:tcPr>
           <w:p>
-            <w:r/>
             <w:r>
               <w:rPr>
                 <w:sz w:val="20"/>
               </w:rPr>
-              <w:t>Nápověda dává směr, ne hotový dotaz; řešení se nabídne až po prvním pokusu a lekce jím splněná se v postupu odliší šedou. Při obcházení se ptej: „Co ten tvůj dotaz dělá?“</w:t>
+              <w:t xml:space="preserve">Nápověda dává směr, ne hotový dotaz; řešení se nabídne až po prvním pokusu s tabulkou z úkolu a úkol jím splněný má šedou fajfku. Při obcházení se ptej: „Co ten tvůj dotaz dělá?“</w:t>
             </w:r>
           </w:p>
         </w:tc>

</xml_diff>

<commit_message>
Databaze v bance: pryc materialy ke skutecnemu DB Browseru
Karel chtel z dlazdice Databaze smazat, co uz neni potreba (24. 9. 2026).
Lekce 14-19 jsou ve virtualnim DB Browseru, knihovnu jde stahnout
i vyexportovat primo z kurzu.
- Smazano: slozka 3 (Navod, Ulohy - DB Browser, Reseni - ulohy)
  a slozka 4 (knihovna.db, knihovna.sql).
- Stranka /sql: pryc sekce „Zaverecna lekce – do praxe“ s odkazy
  na smazane soubory.
- Jak toto tema ucit, Pracovni list a Plan hodin bez odkazu na smazane
  soubory; skutecny program jen jako nepovinny prenos z kurzu.
- Texty v programu a preklady nazvu v bance bez zminek o knihovna.sql.

Co-Authored-By: Claude Opus 5.5 <noreply@anthropic.com>
</commit_message>
<xml_diff>
--- a/public/materialy/1L/8/_ucitel/2. Kurz SQL v prohlížeči/Plán hodin - Kurz SQL.docx
+++ b/public/materialy/1L/8/_ucitel/2. Kurz SQL v prohlížeči/Plán hodin - Kurz SQL.docx
@@ -374,7 +374,7 @@
         <w:rPr>
           <w:b/>
         </w:rPr>
-        <w:t xml:space="preserve">Hodina 2: lekce 14–19 kurzu. Nepovinně pro skutečný program: knihovna.db, Návod - DB Browser, Úlohy - DB Browser (6 úloh)</w:t>
+        <w:t xml:space="preserve">Hodina 2: lekce 14–19 kurzu, všechno v prohlížeči. Skutečný program není potřeba – kdo ho chce zkusit, stáhne si z kurzu svou databázi (Soubor → Uložit kopii do počítače) a otevře ji v DB Browser for SQLite (zdarma).</w:t>
       </w:r>
     </w:p>
     <w:p>
@@ -385,10 +385,7 @@
         <w:rPr>
           <w:b/>
         </w:rPr>
-        <w:t xml:space="preserve">Pro učitele: </w:t>
-      </w:r>
-      <w:r>
-        <w:t>Řešení - pracovní list a Řešení - úlohy ve složkách pro učitele</w:t>
+        <w:t xml:space="preserve">Pro učitele: Řešení - pracovní list ve složce pro učitele</w:t>
       </w:r>
     </w:p>
     <w:p>

</xml_diff>